<commit_message>
Add new column unranked to tl_chronometry
</commit_message>
<xml_diff>
--- a/docx/ranklist.docx
+++ b/docx/ranklist.docx
@@ -82,6 +82,7 @@
         </w:rPr>
         <w:t>Kategorie ${</w:t>
       </w:r>
+      <w:proofErr w:type="spellStart"/>
       <w:r>
         <w:rPr>
           <w:rFonts w:ascii="Century Gothic" w:hAnsi="Century Gothic"/>
@@ -89,6 +90,7 @@
         </w:rPr>
         <w:t>category</w:t>
       </w:r>
+      <w:proofErr w:type="spellEnd"/>
       <w:r>
         <w:rPr>
           <w:rFonts w:ascii="Century Gothic" w:hAnsi="Century Gothic"/>
@@ -109,19 +111,20 @@
           <w:insideH w:val="none" w:sz="0" w:space="0" w:color="auto"/>
           <w:insideV w:val="none" w:sz="0" w:space="0" w:color="auto"/>
         </w:tblBorders>
+        <w:tblLayout w:type="fixed"/>
         <w:tblLook w:val="04A0" w:firstRow="1" w:lastRow="0" w:firstColumn="1" w:lastColumn="0" w:noHBand="0" w:noVBand="1"/>
       </w:tblPr>
       <w:tblGrid>
-        <w:gridCol w:w="888"/>
-        <w:gridCol w:w="1225"/>
-        <w:gridCol w:w="2842"/>
+        <w:gridCol w:w="1134"/>
+        <w:gridCol w:w="1276"/>
+        <w:gridCol w:w="2545"/>
         <w:gridCol w:w="2842"/>
         <w:gridCol w:w="1417"/>
       </w:tblGrid>
       <w:tr>
         <w:tc>
           <w:tcPr>
-            <w:tcW w:w="888" w:type="dxa"/>
+            <w:tcW w:w="1134" w:type="dxa"/>
           </w:tcPr>
           <w:p>
             <w:pPr>
@@ -146,7 +149,7 @@
         </w:tc>
         <w:tc>
           <w:tcPr>
-            <w:tcW w:w="1225" w:type="dxa"/>
+            <w:tcW w:w="1276" w:type="dxa"/>
           </w:tcPr>
           <w:p>
             <w:pPr>
@@ -157,6 +160,7 @@
                 <w:szCs w:val="20"/>
               </w:rPr>
             </w:pPr>
+            <w:proofErr w:type="spellStart"/>
             <w:r>
               <w:rPr>
                 <w:rFonts w:ascii="Century Gothic" w:hAnsi="Century Gothic"/>
@@ -164,13 +168,23 @@
                 <w:sz w:val="20"/>
                 <w:szCs w:val="20"/>
               </w:rPr>
-              <w:t>St.Nr.</w:t>
+              <w:t>St.Nr</w:t>
+            </w:r>
+            <w:proofErr w:type="spellEnd"/>
+            <w:r>
+              <w:rPr>
+                <w:rFonts w:ascii="Century Gothic" w:hAnsi="Century Gothic"/>
+                <w:b/>
+                <w:sz w:val="20"/>
+                <w:szCs w:val="20"/>
+              </w:rPr>
+              <w:t>.</w:t>
             </w:r>
           </w:p>
         </w:tc>
         <w:tc>
           <w:tcPr>
-            <w:tcW w:w="2842" w:type="dxa"/>
+            <w:tcW w:w="2545" w:type="dxa"/>
           </w:tcPr>
           <w:p>
             <w:pPr>
@@ -245,7 +259,7 @@
       <w:tr>
         <w:tc>
           <w:tcPr>
-            <w:tcW w:w="888" w:type="dxa"/>
+            <w:tcW w:w="1134" w:type="dxa"/>
           </w:tcPr>
           <w:p>
             <w:pPr>
@@ -268,7 +282,7 @@
         </w:tc>
         <w:tc>
           <w:tcPr>
-            <w:tcW w:w="1225" w:type="dxa"/>
+            <w:tcW w:w="1276" w:type="dxa"/>
           </w:tcPr>
           <w:p>
             <w:pPr>
@@ -284,7 +298,65 @@
                 <w:sz w:val="20"/>
                 <w:szCs w:val="20"/>
               </w:rPr>
-              <w:t>${number}</w:t>
+              <w:t>${</w:t>
+            </w:r>
+            <w:proofErr w:type="spellStart"/>
+            <w:r>
+              <w:rPr>
+                <w:rFonts w:ascii="Century Gothic" w:hAnsi="Century Gothic"/>
+                <w:sz w:val="20"/>
+                <w:szCs w:val="20"/>
+              </w:rPr>
+              <w:t>number</w:t>
+            </w:r>
+            <w:proofErr w:type="spellEnd"/>
+            <w:r>
+              <w:rPr>
+                <w:rFonts w:ascii="Century Gothic" w:hAnsi="Century Gothic"/>
+                <w:sz w:val="20"/>
+                <w:szCs w:val="20"/>
+              </w:rPr>
+              <w:t>}</w:t>
+            </w:r>
+          </w:p>
+        </w:tc>
+        <w:tc>
+          <w:tcPr>
+            <w:tcW w:w="2545" w:type="dxa"/>
+          </w:tcPr>
+          <w:p>
+            <w:pPr>
+              <w:rPr>
+                <w:rFonts w:ascii="Century Gothic" w:hAnsi="Century Gothic"/>
+                <w:sz w:val="20"/>
+                <w:szCs w:val="20"/>
+              </w:rPr>
+            </w:pPr>
+            <w:r>
+              <w:rPr>
+                <w:rFonts w:ascii="Century Gothic" w:hAnsi="Century Gothic"/>
+                <w:sz w:val="20"/>
+                <w:szCs w:val="20"/>
+              </w:rPr>
+              <w:t>${</w:t>
+            </w:r>
+            <w:proofErr w:type="spellStart"/>
+            <w:r>
+              <w:rPr>
+                <w:rFonts w:ascii="Century Gothic" w:hAnsi="Century Gothic"/>
+                <w:sz w:val="20"/>
+                <w:szCs w:val="20"/>
+              </w:rPr>
+              <w:t>firstname</w:t>
+            </w:r>
+            <w:proofErr w:type="spellEnd"/>
+            <w:r>
+              <w:rPr>
+                <w:rFonts w:ascii="Century Gothic" w:hAnsi="Century Gothic"/>
+                <w:sz w:val="20"/>
+                <w:szCs w:val="20"/>
+              </w:rPr>
+              <w:t>}</w:t>
             </w:r>
           </w:p>
         </w:tc>
@@ -306,30 +378,9 @@
                 <w:sz w:val="20"/>
                 <w:szCs w:val="20"/>
               </w:rPr>
-              <w:t>${firstname}</w:t>
-            </w:r>
-          </w:p>
-        </w:tc>
-        <w:tc>
-          <w:tcPr>
-            <w:tcW w:w="2842" w:type="dxa"/>
-          </w:tcPr>
-          <w:p>
-            <w:pPr>
-              <w:rPr>
-                <w:rFonts w:ascii="Century Gothic" w:hAnsi="Century Gothic"/>
-                <w:sz w:val="20"/>
-                <w:szCs w:val="20"/>
-              </w:rPr>
-            </w:pPr>
-            <w:r>
-              <w:rPr>
-                <w:rFonts w:ascii="Century Gothic" w:hAnsi="Century Gothic"/>
-                <w:sz w:val="20"/>
-                <w:szCs w:val="20"/>
-              </w:rPr>
               <w:t>${</w:t>
             </w:r>
+            <w:proofErr w:type="spellStart"/>
             <w:r>
               <w:rPr>
                 <w:rFonts w:ascii="Century Gothic" w:hAnsi="Century Gothic"/>
@@ -338,6 +389,7 @@
               </w:rPr>
               <w:t>lastname</w:t>
             </w:r>
+            <w:proofErr w:type="spellEnd"/>
             <w:r>
               <w:rPr>
                 <w:rFonts w:ascii="Century Gothic" w:hAnsi="Century Gothic"/>
@@ -379,85 +431,15 @@
         <w:shd w:val="clear" w:color="auto" w:fill="FFFFFF"/>
         <w:rPr>
           <w:color w:val="000000"/>
+          <w:sz w:val="6"/>
+          <w:szCs w:val="6"/>
         </w:rPr>
       </w:pPr>
-      <w:r>
-        <w:rPr>
-          <w:noProof/>
-        </w:rPr>
-        <w:drawing>
-          <wp:anchor distT="0" distB="0" distL="114300" distR="114300" simplePos="0" relativeHeight="251658240" behindDoc="0" locked="0" layoutInCell="1" allowOverlap="1" wp14:anchorId="5415FC56" wp14:editId="20C61231">
-            <wp:simplePos x="0" y="0"/>
-            <wp:positionH relativeFrom="margin">
-              <wp:posOffset>2002155</wp:posOffset>
-            </wp:positionH>
-            <wp:positionV relativeFrom="paragraph">
-              <wp:posOffset>7524115</wp:posOffset>
-            </wp:positionV>
-            <wp:extent cx="952500" cy="829372"/>
-            <wp:effectExtent l="0" t="0" r="0" b="0"/>
-            <wp:wrapNone/>
-            <wp:docPr id="1" name="Grafik 1"/>
-            <wp:cNvGraphicFramePr>
-              <a:graphicFrameLocks xmlns:a="http://schemas.openxmlformats.org/drawingml/2006/main" noChangeAspect="1"/>
-            </wp:cNvGraphicFramePr>
-            <a:graphic xmlns:a="http://schemas.openxmlformats.org/drawingml/2006/main">
-              <a:graphicData uri="http://schemas.openxmlformats.org/drawingml/2006/picture">
-                <pic:pic xmlns:pic="http://schemas.openxmlformats.org/drawingml/2006/picture">
-                  <pic:nvPicPr>
-                    <pic:cNvPr id="0" name="Picture 1"/>
-                    <pic:cNvPicPr>
-                      <a:picLocks noChangeAspect="1" noChangeArrowheads="1"/>
-                    </pic:cNvPicPr>
-                  </pic:nvPicPr>
-                  <pic:blipFill>
-                    <a:blip r:embed="rId6" cstate="print">
-                      <a:extLst>
-                        <a:ext uri="{28A0092B-C50C-407E-A947-70E740481C1C}">
-                          <a14:useLocalDpi xmlns:a14="http://schemas.microsoft.com/office/drawing/2010/main" val="0"/>
-                        </a:ext>
-                      </a:extLst>
-                    </a:blip>
-                    <a:srcRect/>
-                    <a:stretch>
-                      <a:fillRect/>
-                    </a:stretch>
-                  </pic:blipFill>
-                  <pic:spPr bwMode="auto">
-                    <a:xfrm>
-                      <a:off x="0" y="0"/>
-                      <a:ext cx="952500" cy="829372"/>
-                    </a:xfrm>
-                    <a:prstGeom prst="rect">
-                      <a:avLst/>
-                    </a:prstGeom>
-                    <a:noFill/>
-                    <a:ln>
-                      <a:noFill/>
-                    </a:ln>
-                  </pic:spPr>
-                </pic:pic>
-              </a:graphicData>
-            </a:graphic>
-            <wp14:sizeRelH relativeFrom="margin">
-              <wp14:pctWidth>0</wp14:pctWidth>
-            </wp14:sizeRelH>
-            <wp14:sizeRelV relativeFrom="margin">
-              <wp14:pctHeight>0</wp14:pctHeight>
-            </wp14:sizeRelV>
-          </wp:anchor>
-        </w:drawing>
-      </w:r>
     </w:p>
     <w:sectPr>
-      <w:headerReference w:type="even" r:id="rId7"/>
-      <w:headerReference w:type="default" r:id="rId8"/>
-      <w:footerReference w:type="even" r:id="rId9"/>
-      <w:footerReference w:type="default" r:id="rId10"/>
-      <w:headerReference w:type="first" r:id="rId11"/>
-      <w:footerReference w:type="first" r:id="rId12"/>
+      <w:footerReference w:type="default" r:id="rId6"/>
       <w:pgSz w:w="11906" w:h="16838"/>
-      <w:pgMar w:top="426" w:right="1417" w:bottom="1985" w:left="1417" w:header="708" w:footer="1537" w:gutter="0"/>
+      <w:pgMar w:top="425" w:right="1418" w:bottom="1701" w:left="1418" w:header="709" w:footer="739" w:gutter="0"/>
       <w:cols w:space="708"/>
       <w:docGrid w:linePitch="360"/>
     </w:sectPr>
@@ -496,42 +478,23 @@
     <w:pPr>
       <w:pStyle w:val="Fuzeile"/>
     </w:pPr>
-  </w:p>
-</w:ftr>
-</file>
-
-<file path=word/footer2.xml><?xml version="1.0" encoding="utf-8"?>
-<w:ftr xmlns:wpc="http://schemas.microsoft.com/office/word/2010/wordprocessingCanvas" xmlns:cx="http://schemas.microsoft.com/office/drawing/2014/chartex" xmlns:cx1="http://schemas.microsoft.com/office/drawing/2015/9/8/chartex" xmlns:cx2="http://schemas.microsoft.com/office/drawing/2015/10/21/chartex" xmlns:cx3="http://schemas.microsoft.com/office/drawing/2016/5/9/chartex" xmlns:cx4="http://schemas.microsoft.com/office/drawing/2016/5/10/chartex" xmlns:cx5="http://schemas.microsoft.com/office/drawing/2016/5/11/chartex" xmlns:cx6="http://schemas.microsoft.com/office/drawing/2016/5/12/chartex" xmlns:cx7="http://schemas.microsoft.com/office/drawing/2016/5/13/chartex" xmlns:cx8="http://schemas.microsoft.com/office/drawing/2016/5/14/chartex" xmlns:mc="http://schemas.openxmlformats.org/markup-compatibility/2006" xmlns:aink="http://schemas.microsoft.com/office/drawing/2016/ink" xmlns:am3d="http://schemas.microsoft.com/office/drawing/2017/model3d" xmlns:o="urn:schemas-microsoft-com:office:office" xmlns:oel="http://schemas.microsoft.com/office/2019/extlst" xmlns:r="http://schemas.openxmlformats.org/officeDocument/2006/relationships" xmlns:m="http://schemas.openxmlformats.org/officeDocument/2006/math" xmlns:v="urn:schemas-microsoft-com:vml" xmlns:wp14="http://schemas.microsoft.com/office/word/2010/wordprocessingDrawing" xmlns:wp="http://schemas.openxmlformats.org/drawingml/2006/wordprocessingDrawing" xmlns:w10="urn:schemas-microsoft-com:office:word" xmlns:w="http://schemas.openxmlformats.org/wordprocessingml/2006/main" xmlns:w14="http://schemas.microsoft.com/office/word/2010/wordml" xmlns:w15="http://schemas.microsoft.com/office/word/2012/wordml" xmlns:w16cex="http://schemas.microsoft.com/office/word/2018/wordml/cex" xmlns:w16cid="http://schemas.microsoft.com/office/word/2016/wordml/cid" xmlns:w16="http://schemas.microsoft.com/office/word/2018/wordml" xmlns:w16du="http://schemas.microsoft.com/office/word/2023/wordml/word16du" xmlns:w16sdtdh="http://schemas.microsoft.com/office/word/2020/wordml/sdtdatahash" xmlns:w16sdtfl="http://schemas.microsoft.com/office/word/2024/wordml/sdtformatlock" xmlns:w16se="http://schemas.microsoft.com/office/word/2015/wordml/symex" xmlns:wpg="http://schemas.microsoft.com/office/word/2010/wordprocessingGroup" xmlns:wpi="http://schemas.microsoft.com/office/word/2010/wordprocessingInk" xmlns:wne="http://schemas.microsoft.com/office/word/2006/wordml" xmlns:wps="http://schemas.microsoft.com/office/word/2010/wordprocessingShape" mc:Ignorable="w14 w15 w16se w16cid w16 w16cex w16sdtdh w16sdtfl w16du wp14">
-  <w:p>
-    <w:pPr>
-      <w:pStyle w:val="Fuzeile"/>
-    </w:pPr>
     <w:r>
       <w:rPr>
         <w:noProof/>
-        <w:lang w:eastAsia="de-CH"/>
       </w:rPr>
       <w:drawing>
-        <wp:anchor distT="0" distB="0" distL="114300" distR="114300" simplePos="0" relativeHeight="251662336" behindDoc="1" locked="0" layoutInCell="1" allowOverlap="1" wp14:anchorId="52B3EB03" wp14:editId="5B4BB90A">
+        <wp:anchor distT="0" distB="0" distL="114300" distR="114300" simplePos="0" relativeHeight="251664384" behindDoc="0" locked="0" layoutInCell="1" allowOverlap="1" wp14:anchorId="49D3F6CD" wp14:editId="1D573192">
           <wp:simplePos x="0" y="0"/>
           <wp:positionH relativeFrom="margin">
-            <wp:align>left</wp:align>
+            <wp:posOffset>4804020</wp:posOffset>
           </wp:positionH>
           <wp:positionV relativeFrom="paragraph">
-            <wp:posOffset>15240</wp:posOffset>
+            <wp:posOffset>18757</wp:posOffset>
           </wp:positionV>
-          <wp:extent cx="476250" cy="833120"/>
-          <wp:effectExtent l="0" t="0" r="0" b="5080"/>
-          <wp:wrapTight wrapText="bothSides">
-            <wp:wrapPolygon edited="0">
-              <wp:start x="0" y="0"/>
-              <wp:lineTo x="0" y="21238"/>
-              <wp:lineTo x="20736" y="21238"/>
-              <wp:lineTo x="20736" y="0"/>
-              <wp:lineTo x="0" y="0"/>
-            </wp:wrapPolygon>
-          </wp:wrapTight>
-          <wp:docPr id="40" name="Grafik 40" descr="logo-g"/>
+          <wp:extent cx="738554" cy="643082"/>
+          <wp:effectExtent l="0" t="0" r="4445" b="5080"/>
+          <wp:wrapNone/>
+          <wp:docPr id="1940545871" name="Grafik 1940545871"/>
           <wp:cNvGraphicFramePr>
             <a:graphicFrameLocks xmlns:a="http://schemas.openxmlformats.org/drawingml/2006/main" noChangeAspect="1"/>
           </wp:cNvGraphicFramePr>
@@ -539,13 +502,13 @@
             <a:graphicData uri="http://schemas.openxmlformats.org/drawingml/2006/picture">
               <pic:pic xmlns:pic="http://schemas.openxmlformats.org/drawingml/2006/picture">
                 <pic:nvPicPr>
-                  <pic:cNvPr id="0" name="Grafik 1" descr="logo-g"/>
+                  <pic:cNvPr id="0" name="Picture 1"/>
                   <pic:cNvPicPr>
-                    <a:picLocks noChangeArrowheads="1"/>
+                    <a:picLocks noChangeAspect="1" noChangeArrowheads="1"/>
                   </pic:cNvPicPr>
                 </pic:nvPicPr>
                 <pic:blipFill>
-                  <a:blip r:embed="rId1">
+                  <a:blip r:embed="rId1" cstate="print">
                     <a:extLst>
                       <a:ext uri="{28A0092B-C50C-407E-A947-70E740481C1C}">
                         <a14:useLocalDpi xmlns:a14="http://schemas.microsoft.com/office/drawing/2010/main" val="0"/>
@@ -560,35 +523,81 @@
                 <pic:spPr bwMode="auto">
                   <a:xfrm>
                     <a:off x="0" y="0"/>
-                    <a:ext cx="476250" cy="833120"/>
+                    <a:ext cx="743009" cy="646961"/>
                   </a:xfrm>
                   <a:prstGeom prst="rect">
                     <a:avLst/>
                   </a:prstGeom>
                   <a:noFill/>
+                  <a:ln>
+                    <a:noFill/>
+                  </a:ln>
                 </pic:spPr>
               </pic:pic>
             </a:graphicData>
           </a:graphic>
-          <wp14:sizeRelH relativeFrom="page">
+          <wp14:sizeRelH relativeFrom="margin">
             <wp14:pctWidth>0</wp14:pctWidth>
           </wp14:sizeRelH>
-          <wp14:sizeRelV relativeFrom="page">
+          <wp14:sizeRelV relativeFrom="margin">
             <wp14:pctHeight>0</wp14:pctHeight>
           </wp14:sizeRelV>
         </wp:anchor>
       </w:drawing>
     </w:r>
-  </w:p>
-</w:ftr>
-</file>
-
-<file path=word/footer3.xml><?xml version="1.0" encoding="utf-8"?>
-<w:ftr xmlns:wpc="http://schemas.microsoft.com/office/word/2010/wordprocessingCanvas" xmlns:cx="http://schemas.microsoft.com/office/drawing/2014/chartex" xmlns:cx1="http://schemas.microsoft.com/office/drawing/2015/9/8/chartex" xmlns:cx2="http://schemas.microsoft.com/office/drawing/2015/10/21/chartex" xmlns:cx3="http://schemas.microsoft.com/office/drawing/2016/5/9/chartex" xmlns:cx4="http://schemas.microsoft.com/office/drawing/2016/5/10/chartex" xmlns:cx5="http://schemas.microsoft.com/office/drawing/2016/5/11/chartex" xmlns:cx6="http://schemas.microsoft.com/office/drawing/2016/5/12/chartex" xmlns:cx7="http://schemas.microsoft.com/office/drawing/2016/5/13/chartex" xmlns:cx8="http://schemas.microsoft.com/office/drawing/2016/5/14/chartex" xmlns:mc="http://schemas.openxmlformats.org/markup-compatibility/2006" xmlns:aink="http://schemas.microsoft.com/office/drawing/2016/ink" xmlns:am3d="http://schemas.microsoft.com/office/drawing/2017/model3d" xmlns:o="urn:schemas-microsoft-com:office:office" xmlns:oel="http://schemas.microsoft.com/office/2019/extlst" xmlns:r="http://schemas.openxmlformats.org/officeDocument/2006/relationships" xmlns:m="http://schemas.openxmlformats.org/officeDocument/2006/math" xmlns:v="urn:schemas-microsoft-com:vml" xmlns:wp14="http://schemas.microsoft.com/office/word/2010/wordprocessingDrawing" xmlns:wp="http://schemas.openxmlformats.org/drawingml/2006/wordprocessingDrawing" xmlns:w10="urn:schemas-microsoft-com:office:word" xmlns:w="http://schemas.openxmlformats.org/wordprocessingml/2006/main" xmlns:w14="http://schemas.microsoft.com/office/word/2010/wordml" xmlns:w15="http://schemas.microsoft.com/office/word/2012/wordml" xmlns:w16cex="http://schemas.microsoft.com/office/word/2018/wordml/cex" xmlns:w16cid="http://schemas.microsoft.com/office/word/2016/wordml/cid" xmlns:w16="http://schemas.microsoft.com/office/word/2018/wordml" xmlns:w16du="http://schemas.microsoft.com/office/word/2023/wordml/word16du" xmlns:w16sdtdh="http://schemas.microsoft.com/office/word/2020/wordml/sdtdatahash" xmlns:w16sdtfl="http://schemas.microsoft.com/office/word/2024/wordml/sdtformatlock" xmlns:w16se="http://schemas.microsoft.com/office/word/2015/wordml/symex" xmlns:wpg="http://schemas.microsoft.com/office/word/2010/wordprocessingGroup" xmlns:wpi="http://schemas.microsoft.com/office/word/2010/wordprocessingInk" xmlns:wne="http://schemas.microsoft.com/office/word/2006/wordml" xmlns:wps="http://schemas.microsoft.com/office/word/2010/wordprocessingShape" mc:Ignorable="w14 w15 w16se w16cid w16 w16cex w16sdtdh w16sdtfl w16du wp14">
-  <w:p>
-    <w:pPr>
-      <w:pStyle w:val="Fuzeile"/>
-    </w:pPr>
+    <w:r>
+      <w:rPr>
+        <w:noProof/>
+      </w:rPr>
+      <w:drawing>
+        <wp:inline distT="0" distB="0" distL="0" distR="0" wp14:anchorId="12A20D01" wp14:editId="536FB6AF">
+          <wp:extent cx="877691" cy="500280"/>
+          <wp:effectExtent l="0" t="0" r="0" b="0"/>
+          <wp:docPr id="1808786266" name="Grafik 2"/>
+          <wp:cNvGraphicFramePr>
+            <a:graphicFrameLocks xmlns:a="http://schemas.openxmlformats.org/drawingml/2006/main" noChangeAspect="1"/>
+          </wp:cNvGraphicFramePr>
+          <a:graphic xmlns:a="http://schemas.openxmlformats.org/drawingml/2006/main">
+            <a:graphicData uri="http://schemas.openxmlformats.org/drawingml/2006/picture">
+              <pic:pic xmlns:pic="http://schemas.openxmlformats.org/drawingml/2006/picture">
+                <pic:nvPicPr>
+                  <pic:cNvPr id="0" name="Picture 6"/>
+                  <pic:cNvPicPr>
+                    <a:picLocks noChangeAspect="1" noChangeArrowheads="1"/>
+                  </pic:cNvPicPr>
+                </pic:nvPicPr>
+                <pic:blipFill>
+                  <a:blip r:embed="rId2">
+                    <a:extLst>
+                      <a:ext uri="{28A0092B-C50C-407E-A947-70E740481C1C}">
+                        <a14:useLocalDpi xmlns:a14="http://schemas.microsoft.com/office/drawing/2010/main" val="0"/>
+                      </a:ext>
+                    </a:extLst>
+                  </a:blip>
+                  <a:srcRect/>
+                  <a:stretch>
+                    <a:fillRect/>
+                  </a:stretch>
+                </pic:blipFill>
+                <pic:spPr bwMode="auto">
+                  <a:xfrm>
+                    <a:off x="0" y="0"/>
+                    <a:ext cx="886186" cy="505122"/>
+                  </a:xfrm>
+                  <a:prstGeom prst="rect">
+                    <a:avLst/>
+                  </a:prstGeom>
+                  <a:noFill/>
+                  <a:ln>
+                    <a:noFill/>
+                  </a:ln>
+                </pic:spPr>
+              </pic:pic>
+            </a:graphicData>
+          </a:graphic>
+        </wp:inline>
+      </w:drawing>
+    </w:r>
   </w:p>
 </w:ftr>
 </file>
@@ -616,36 +625,6 @@
     </w:p>
   </w:footnote>
 </w:footnotes>
-</file>
-
-<file path=word/header1.xml><?xml version="1.0" encoding="utf-8"?>
-<w:hdr xmlns:wpc="http://schemas.microsoft.com/office/word/2010/wordprocessingCanvas" xmlns:cx="http://schemas.microsoft.com/office/drawing/2014/chartex" xmlns:cx1="http://schemas.microsoft.com/office/drawing/2015/9/8/chartex" xmlns:cx2="http://schemas.microsoft.com/office/drawing/2015/10/21/chartex" xmlns:cx3="http://schemas.microsoft.com/office/drawing/2016/5/9/chartex" xmlns:cx4="http://schemas.microsoft.com/office/drawing/2016/5/10/chartex" xmlns:cx5="http://schemas.microsoft.com/office/drawing/2016/5/11/chartex" xmlns:cx6="http://schemas.microsoft.com/office/drawing/2016/5/12/chartex" xmlns:cx7="http://schemas.microsoft.com/office/drawing/2016/5/13/chartex" xmlns:cx8="http://schemas.microsoft.com/office/drawing/2016/5/14/chartex" xmlns:mc="http://schemas.openxmlformats.org/markup-compatibility/2006" xmlns:aink="http://schemas.microsoft.com/office/drawing/2016/ink" xmlns:am3d="http://schemas.microsoft.com/office/drawing/2017/model3d" xmlns:o="urn:schemas-microsoft-com:office:office" xmlns:oel="http://schemas.microsoft.com/office/2019/extlst" xmlns:r="http://schemas.openxmlformats.org/officeDocument/2006/relationships" xmlns:m="http://schemas.openxmlformats.org/officeDocument/2006/math" xmlns:v="urn:schemas-microsoft-com:vml" xmlns:wp14="http://schemas.microsoft.com/office/word/2010/wordprocessingDrawing" xmlns:wp="http://schemas.openxmlformats.org/drawingml/2006/wordprocessingDrawing" xmlns:w10="urn:schemas-microsoft-com:office:word" xmlns:w="http://schemas.openxmlformats.org/wordprocessingml/2006/main" xmlns:w14="http://schemas.microsoft.com/office/word/2010/wordml" xmlns:w15="http://schemas.microsoft.com/office/word/2012/wordml" xmlns:w16cex="http://schemas.microsoft.com/office/word/2018/wordml/cex" xmlns:w16cid="http://schemas.microsoft.com/office/word/2016/wordml/cid" xmlns:w16="http://schemas.microsoft.com/office/word/2018/wordml" xmlns:w16du="http://schemas.microsoft.com/office/word/2023/wordml/word16du" xmlns:w16sdtdh="http://schemas.microsoft.com/office/word/2020/wordml/sdtdatahash" xmlns:w16sdtfl="http://schemas.microsoft.com/office/word/2024/wordml/sdtformatlock" xmlns:w16se="http://schemas.microsoft.com/office/word/2015/wordml/symex" xmlns:wpg="http://schemas.microsoft.com/office/word/2010/wordprocessingGroup" xmlns:wpi="http://schemas.microsoft.com/office/word/2010/wordprocessingInk" xmlns:wne="http://schemas.microsoft.com/office/word/2006/wordml" xmlns:wps="http://schemas.microsoft.com/office/word/2010/wordprocessingShape" mc:Ignorable="w14 w15 w16se w16cid w16 w16cex w16sdtdh w16sdtfl w16du wp14">
-  <w:p>
-    <w:pPr>
-      <w:pStyle w:val="Kopfzeile"/>
-    </w:pPr>
-  </w:p>
-</w:hdr>
-</file>
-
-<file path=word/header2.xml><?xml version="1.0" encoding="utf-8"?>
-<w:hdr xmlns:wpc="http://schemas.microsoft.com/office/word/2010/wordprocessingCanvas" xmlns:cx="http://schemas.microsoft.com/office/drawing/2014/chartex" xmlns:cx1="http://schemas.microsoft.com/office/drawing/2015/9/8/chartex" xmlns:cx2="http://schemas.microsoft.com/office/drawing/2015/10/21/chartex" xmlns:cx3="http://schemas.microsoft.com/office/drawing/2016/5/9/chartex" xmlns:cx4="http://schemas.microsoft.com/office/drawing/2016/5/10/chartex" xmlns:cx5="http://schemas.microsoft.com/office/drawing/2016/5/11/chartex" xmlns:cx6="http://schemas.microsoft.com/office/drawing/2016/5/12/chartex" xmlns:cx7="http://schemas.microsoft.com/office/drawing/2016/5/13/chartex" xmlns:cx8="http://schemas.microsoft.com/office/drawing/2016/5/14/chartex" xmlns:mc="http://schemas.openxmlformats.org/markup-compatibility/2006" xmlns:aink="http://schemas.microsoft.com/office/drawing/2016/ink" xmlns:am3d="http://schemas.microsoft.com/office/drawing/2017/model3d" xmlns:o="urn:schemas-microsoft-com:office:office" xmlns:oel="http://schemas.microsoft.com/office/2019/extlst" xmlns:r="http://schemas.openxmlformats.org/officeDocument/2006/relationships" xmlns:m="http://schemas.openxmlformats.org/officeDocument/2006/math" xmlns:v="urn:schemas-microsoft-com:vml" xmlns:wp14="http://schemas.microsoft.com/office/word/2010/wordprocessingDrawing" xmlns:wp="http://schemas.openxmlformats.org/drawingml/2006/wordprocessingDrawing" xmlns:w10="urn:schemas-microsoft-com:office:word" xmlns:w="http://schemas.openxmlformats.org/wordprocessingml/2006/main" xmlns:w14="http://schemas.microsoft.com/office/word/2010/wordml" xmlns:w15="http://schemas.microsoft.com/office/word/2012/wordml" xmlns:w16cex="http://schemas.microsoft.com/office/word/2018/wordml/cex" xmlns:w16cid="http://schemas.microsoft.com/office/word/2016/wordml/cid" xmlns:w16="http://schemas.microsoft.com/office/word/2018/wordml" xmlns:w16du="http://schemas.microsoft.com/office/word/2023/wordml/word16du" xmlns:w16sdtdh="http://schemas.microsoft.com/office/word/2020/wordml/sdtdatahash" xmlns:w16sdtfl="http://schemas.microsoft.com/office/word/2024/wordml/sdtformatlock" xmlns:w16se="http://schemas.microsoft.com/office/word/2015/wordml/symex" xmlns:wpg="http://schemas.microsoft.com/office/word/2010/wordprocessingGroup" xmlns:wpi="http://schemas.microsoft.com/office/word/2010/wordprocessingInk" xmlns:wne="http://schemas.microsoft.com/office/word/2006/wordml" xmlns:wps="http://schemas.microsoft.com/office/word/2010/wordprocessingShape" mc:Ignorable="w14 w15 w16se w16cid w16 w16cex w16sdtdh w16sdtfl w16du wp14">
-  <w:p>
-    <w:pPr>
-      <w:pStyle w:val="Kopfzeile"/>
-    </w:pPr>
-  </w:p>
-</w:hdr>
-</file>
-
-<file path=word/header3.xml><?xml version="1.0" encoding="utf-8"?>
-<w:hdr xmlns:wpc="http://schemas.microsoft.com/office/word/2010/wordprocessingCanvas" xmlns:cx="http://schemas.microsoft.com/office/drawing/2014/chartex" xmlns:cx1="http://schemas.microsoft.com/office/drawing/2015/9/8/chartex" xmlns:cx2="http://schemas.microsoft.com/office/drawing/2015/10/21/chartex" xmlns:cx3="http://schemas.microsoft.com/office/drawing/2016/5/9/chartex" xmlns:cx4="http://schemas.microsoft.com/office/drawing/2016/5/10/chartex" xmlns:cx5="http://schemas.microsoft.com/office/drawing/2016/5/11/chartex" xmlns:cx6="http://schemas.microsoft.com/office/drawing/2016/5/12/chartex" xmlns:cx7="http://schemas.microsoft.com/office/drawing/2016/5/13/chartex" xmlns:cx8="http://schemas.microsoft.com/office/drawing/2016/5/14/chartex" xmlns:mc="http://schemas.openxmlformats.org/markup-compatibility/2006" xmlns:aink="http://schemas.microsoft.com/office/drawing/2016/ink" xmlns:am3d="http://schemas.microsoft.com/office/drawing/2017/model3d" xmlns:o="urn:schemas-microsoft-com:office:office" xmlns:oel="http://schemas.microsoft.com/office/2019/extlst" xmlns:r="http://schemas.openxmlformats.org/officeDocument/2006/relationships" xmlns:m="http://schemas.openxmlformats.org/officeDocument/2006/math" xmlns:v="urn:schemas-microsoft-com:vml" xmlns:wp14="http://schemas.microsoft.com/office/word/2010/wordprocessingDrawing" xmlns:wp="http://schemas.openxmlformats.org/drawingml/2006/wordprocessingDrawing" xmlns:w10="urn:schemas-microsoft-com:office:word" xmlns:w="http://schemas.openxmlformats.org/wordprocessingml/2006/main" xmlns:w14="http://schemas.microsoft.com/office/word/2010/wordml" xmlns:w15="http://schemas.microsoft.com/office/word/2012/wordml" xmlns:w16cex="http://schemas.microsoft.com/office/word/2018/wordml/cex" xmlns:w16cid="http://schemas.microsoft.com/office/word/2016/wordml/cid" xmlns:w16="http://schemas.microsoft.com/office/word/2018/wordml" xmlns:w16du="http://schemas.microsoft.com/office/word/2023/wordml/word16du" xmlns:w16sdtdh="http://schemas.microsoft.com/office/word/2020/wordml/sdtdatahash" xmlns:w16sdtfl="http://schemas.microsoft.com/office/word/2024/wordml/sdtformatlock" xmlns:w16se="http://schemas.microsoft.com/office/word/2015/wordml/symex" xmlns:wpg="http://schemas.microsoft.com/office/word/2010/wordprocessingGroup" xmlns:wpi="http://schemas.microsoft.com/office/word/2010/wordprocessingInk" xmlns:wne="http://schemas.microsoft.com/office/word/2006/wordml" xmlns:wps="http://schemas.microsoft.com/office/word/2010/wordprocessingShape" mc:Ignorable="w14 w15 w16se w16cid w16 w16cex w16sdtdh w16sdtfl w16du wp14">
-  <w:p>
-    <w:pPr>
-      <w:pStyle w:val="Kopfzeile"/>
-    </w:pPr>
-  </w:p>
-</w:hdr>
 </file>
 
 <file path=word/styles.xml><?xml version="1.0" encoding="utf-8"?>
@@ -1185,6 +1164,19 @@
       <w:lang w:eastAsia="de-CH"/>
     </w:rPr>
   </w:style>
+  <w:style w:type="paragraph" w:styleId="StandardWeb">
+    <w:name w:val="Normal (Web)"/>
+    <w:basedOn w:val="Standard"/>
+    <w:uiPriority w:val="99"/>
+    <w:semiHidden/>
+    <w:unhideWhenUsed/>
+    <w:rsid w:val="000E7878"/>
+    <w:rPr>
+      <w:rFonts w:ascii="Times New Roman" w:hAnsi="Times New Roman" w:cs="Times New Roman"/>
+      <w:sz w:val="24"/>
+      <w:szCs w:val="24"/>
+    </w:rPr>
+  </w:style>
 </w:styles>
 </file>
 

</xml_diff>